<commit_message>
Manuel v1.1 : section Découvert autorisé + capture
Co-Authored-By: Claude Opus 4.8 (1M context) <noreply@anthropic.com>
</commit_message>
<xml_diff>
--- a/docs/Manuel_CAMPOST_Core_Banking.docx
+++ b/docs/Manuel_CAMPOST_Core_Banking.docx
@@ -97,7 +97,7 @@
           <w:color w:val="6B7178"/>
           <w:sz w:val="24"/>
         </w:rPr>
-        <w:t>Version 1.0</w:t>
+        <w:t>Version 1.1</w:t>
       </w:r>
     </w:p>
     <w:p>
@@ -1081,6 +1081,102 @@
     </w:p>
     <w:p>
       <w:pPr>
+        <w:spacing w:before="200" w:after="80"/>
+      </w:pPr>
+      <w:r>
+        <w:rPr>
+          <w:b/>
+          <w:color w:val="11191F"/>
+          <w:sz w:val="26"/>
+        </w:rPr>
+        <w:t>Découvert autorisé</w:t>
+      </w:r>
+    </w:p>
+    <w:p>
+      <w:r>
+        <w:t>Un compte peut bénéficier d'un découvert autorisé : un plafond qui permet d'accepter des retraits au-delà du solde disponible. Le solde du compte peut alors devenir négatif, dans la limite de ce plafond.</w:t>
+      </w:r>
+    </w:p>
+    <w:p>
+      <w:pPr>
+        <w:pStyle w:val="ListBullet"/>
+      </w:pPr>
+      <w:r>
+        <w:t>Depuis la fiche compte, le bouton « Découvert » ouvre une fenêtre permettant de définir ou de modifier le plafond (saisir 0 pour le désactiver).</w:t>
+      </w:r>
+    </w:p>
+    <w:p>
+      <w:pPr>
+        <w:pStyle w:val="ListBullet"/>
+      </w:pPr>
+      <w:r>
+        <w:t>La fiche affiche le découvert autorisé et le disponible (solde plus découvert). Un solde négatif s'affiche en rouge, accompagné de la mention « En découvert ».</w:t>
+      </w:r>
+    </w:p>
+    <w:p>
+      <w:pPr>
+        <w:pStyle w:val="ListBullet"/>
+      </w:pPr>
+      <w:r>
+        <w:t>Lors d'un retrait, le contrôle porte sur le disponible : l'opération est acceptée tant que le montant ne dépasse pas le solde augmenté du découvert autorisé.</w:t>
+      </w:r>
+    </w:p>
+    <w:p>
+      <w:pPr>
+        <w:spacing w:before="120"/>
+        <w:jc w:val="center"/>
+      </w:pPr>
+      <w:r>
+        <w:drawing>
+          <wp:inline xmlns:a="http://schemas.openxmlformats.org/drawingml/2006/main" xmlns:pic="http://schemas.openxmlformats.org/drawingml/2006/picture">
+            <wp:extent cx="5580000" cy="3952500"/>
+            <wp:docPr id="7" name="Picture 7"/>
+            <wp:cNvGraphicFramePr>
+              <a:graphicFrameLocks noChangeAspect="1"/>
+            </wp:cNvGraphicFramePr>
+            <a:graphic>
+              <a:graphicData uri="http://schemas.openxmlformats.org/drawingml/2006/picture">
+                <pic:pic>
+                  <pic:nvPicPr>
+                    <pic:cNvPr id="0" name="09-decouvert.png"/>
+                    <pic:cNvPicPr/>
+                  </pic:nvPicPr>
+                  <pic:blipFill>
+                    <a:blip r:embed="rId16"/>
+                    <a:stretch>
+                      <a:fillRect/>
+                    </a:stretch>
+                  </pic:blipFill>
+                  <pic:spPr>
+                    <a:xfrm>
+                      <a:off x="0" y="0"/>
+                      <a:ext cx="5580000" cy="3952500"/>
+                    </a:xfrm>
+                    <a:prstGeom prst="rect"/>
+                  </pic:spPr>
+                </pic:pic>
+              </a:graphicData>
+            </a:graphic>
+          </wp:inline>
+        </w:drawing>
+      </w:r>
+    </w:p>
+    <w:p>
+      <w:pPr>
+        <w:spacing w:after="200"/>
+        <w:jc w:val="center"/>
+      </w:pPr>
+      <w:r>
+        <w:rPr>
+          <w:i/>
+          <w:color w:val="6B7178"/>
+          <w:sz w:val="18"/>
+        </w:rPr>
+        <w:t>Compte en découvert : solde négatif et disponible recalculé.</w:t>
+      </w:r>
+    </w:p>
+    <w:p>
+      <w:pPr>
         <w:spacing w:before="280" w:after="160"/>
         <w:pBdr>
           <w:bottom w:val="single" w:sz="6" w:space="4" w:color="1F3A5F"/>
@@ -1121,7 +1217,7 @@
         <w:pStyle w:val="ListBullet"/>
       </w:pPr>
       <w:r>
-        <w:t>Contrôle : un retrait supérieur au solde disponible est refusé ; aucune opération n'est possible sur un compte gelé ou clôturé.</w:t>
+        <w:t>Contrôle : un retrait est accepté dans la limite du disponible (solde augmenté du découvert autorisé éventuel) ; au-delà, il est refusé. Aucune opération n'est possible sur un compte gelé ou clôturé.</w:t>
       </w:r>
     </w:p>
     <w:p>
@@ -1133,7 +1229,7 @@
         <w:drawing>
           <wp:inline xmlns:a="http://schemas.openxmlformats.org/drawingml/2006/main" xmlns:pic="http://schemas.openxmlformats.org/drawingml/2006/picture">
             <wp:extent cx="5580000" cy="3952500"/>
-            <wp:docPr id="7" name="Picture 7"/>
+            <wp:docPr id="8" name="Picture 8"/>
             <wp:cNvGraphicFramePr>
               <a:graphicFrameLocks noChangeAspect="1"/>
             </wp:cNvGraphicFramePr>
@@ -1145,7 +1241,7 @@
                     <pic:cNvPicPr/>
                   </pic:nvPicPr>
                   <pic:blipFill>
-                    <a:blip r:embed="rId16"/>
+                    <a:blip r:embed="rId17"/>
                     <a:stretch>
                       <a:fillRect/>
                     </a:stretch>
@@ -1253,7 +1349,7 @@
         <w:drawing>
           <wp:inline xmlns:a="http://schemas.openxmlformats.org/drawingml/2006/main" xmlns:pic="http://schemas.openxmlformats.org/drawingml/2006/picture">
             <wp:extent cx="5580000" cy="3952500"/>
-            <wp:docPr id="8" name="Picture 8"/>
+            <wp:docPr id="9" name="Picture 9"/>
             <wp:cNvGraphicFramePr>
               <a:graphicFrameLocks noChangeAspect="1"/>
             </wp:cNvGraphicFramePr>
@@ -1265,7 +1361,7 @@
                     <pic:cNvPicPr/>
                   </pic:nvPicPr>
                   <pic:blipFill>
-                    <a:blip r:embed="rId17"/>
+                    <a:blip r:embed="rId18"/>
                     <a:stretch>
                       <a:fillRect/>
                     </a:stretch>

</xml_diff>